<commit_message>
Agrega pantalla de Crear cuenta, usuario semilla Admin/admin, backend con registro auto-login, y documentacion actualizada
</commit_message>
<xml_diff>
--- a/NotasApp/Documentacion_NotasApp.docx
+++ b/NotasApp/Documentacion_NotasApp.docx
@@ -550,7 +550,7 @@
                 <w:sz w:val="20"/>
                 <w:szCs w:val="20"/>
               </w:rPr>
-              <w:t xml:space="preserve">ui.login / ui.dashboard / ui.createnote / ui.noteslist</w:t>
+              <w:t xml:space="preserve">ui.login / ui.register / ui.dashboard / ui.createnote / ui.noteslist</w:t>
             </w:r>
           </w:p>
         </w:tc>
@@ -631,115 +631,115 @@
           <w:sz w:val="20"/>
           <w:szCs w:val="20"/>
         </w:rPr>
-        <w:t xml:space="preserve">LoginActivity</w:t>
-      </w:r>
-    </w:p>
-    <w:p>
-      <w:pPr>
-        <w:pBdr>
-          <w:left w:val="single" w:color="CCCCCC" w:sz="4"/>
-          <w:right w:val="single" w:color="CCCCCC" w:sz="4"/>
-        </w:pBdr>
-        <w:shd w:fill="F2F2F2" w:val="clear"/>
-        <w:spacing w:after="0"/>
-      </w:pPr>
-      <w:r>
-        <w:rPr>
-          <w:rFonts w:ascii="Consolas" w:cs="Consolas" w:eastAsia="Consolas" w:hAnsi="Consolas"/>
-          <w:sz w:val="20"/>
-          <w:szCs w:val="20"/>
-        </w:rPr>
-        <w:t xml:space="preserve">   │  login exitoso, o ya había una sesión guardada</w:t>
-      </w:r>
-    </w:p>
-    <w:p>
-      <w:pPr>
-        <w:pBdr>
-          <w:left w:val="single" w:color="CCCCCC" w:sz="4"/>
-          <w:right w:val="single" w:color="CCCCCC" w:sz="4"/>
-        </w:pBdr>
-        <w:shd w:fill="F2F2F2" w:val="clear"/>
-        <w:spacing w:after="0"/>
-      </w:pPr>
-      <w:r>
-        <w:rPr>
-          <w:rFonts w:ascii="Consolas" w:cs="Consolas" w:eastAsia="Consolas" w:hAnsi="Consolas"/>
-          <w:sz w:val="20"/>
-          <w:szCs w:val="20"/>
-        </w:rPr>
-        <w:t xml:space="preserve">   ▼</w:t>
-      </w:r>
-    </w:p>
-    <w:p>
-      <w:pPr>
-        <w:pBdr>
-          <w:left w:val="single" w:color="CCCCCC" w:sz="4"/>
-          <w:right w:val="single" w:color="CCCCCC" w:sz="4"/>
-        </w:pBdr>
-        <w:shd w:fill="F2F2F2" w:val="clear"/>
-        <w:spacing w:after="0"/>
-      </w:pPr>
-      <w:r>
-        <w:rPr>
-          <w:rFonts w:ascii="Consolas" w:cs="Consolas" w:eastAsia="Consolas" w:hAnsi="Consolas"/>
-          <w:sz w:val="20"/>
-          <w:szCs w:val="20"/>
-        </w:rPr>
-        <w:t xml:space="preserve">DashboardActivity  ──────────────┐</w:t>
-      </w:r>
-    </w:p>
-    <w:p>
-      <w:pPr>
-        <w:pBdr>
-          <w:left w:val="single" w:color="CCCCCC" w:sz="4"/>
-          <w:right w:val="single" w:color="CCCCCC" w:sz="4"/>
-        </w:pBdr>
-        <w:shd w:fill="F2F2F2" w:val="clear"/>
-        <w:spacing w:after="0"/>
-      </w:pPr>
-      <w:r>
-        <w:rPr>
-          <w:rFonts w:ascii="Consolas" w:cs="Consolas" w:eastAsia="Consolas" w:hAnsi="Consolas"/>
-          <w:sz w:val="20"/>
-          <w:szCs w:val="20"/>
-        </w:rPr>
-        <w:t xml:space="preserve">   │                            │</w:t>
-      </w:r>
-    </w:p>
-    <w:p>
-      <w:pPr>
-        <w:pBdr>
-          <w:left w:val="single" w:color="CCCCCC" w:sz="4"/>
-          <w:right w:val="single" w:color="CCCCCC" w:sz="4"/>
-        </w:pBdr>
-        <w:shd w:fill="F2F2F2" w:val="clear"/>
-        <w:spacing w:after="0"/>
-      </w:pPr>
-      <w:r>
-        <w:rPr>
-          <w:rFonts w:ascii="Consolas" w:cs="Consolas" w:eastAsia="Consolas" w:hAnsi="Consolas"/>
-          <w:sz w:val="20"/>
-          <w:szCs w:val="20"/>
-        </w:rPr>
-        <w:t xml:space="preserve">   ▼ "Crear nota"                ▼ "Ver mis notas"</w:t>
-      </w:r>
-    </w:p>
-    <w:p>
-      <w:pPr>
-        <w:pBdr>
-          <w:left w:val="single" w:color="CCCCCC" w:sz="4"/>
-          <w:right w:val="single" w:color="CCCCCC" w:sz="4"/>
-        </w:pBdr>
-        <w:shd w:fill="F2F2F2" w:val="clear"/>
-        <w:spacing w:after="0"/>
-      </w:pPr>
-      <w:r>
-        <w:rPr>
-          <w:rFonts w:ascii="Consolas" w:cs="Consolas" w:eastAsia="Consolas" w:hAnsi="Consolas"/>
-          <w:sz w:val="20"/>
-          <w:szCs w:val="20"/>
-        </w:rPr>
-        <w:t xml:space="preserve">CreateNoteActivity          NotesListActivity</w:t>
+        <w:t xml:space="preserve">LoginActivity  ── "¿No tienes cuenta?" ──▶  RegisterActivity</w:t>
+      </w:r>
+    </w:p>
+    <w:p>
+      <w:pPr>
+        <w:pBdr>
+          <w:left w:val="single" w:color="CCCCCC" w:sz="4"/>
+          <w:right w:val="single" w:color="CCCCCC" w:sz="4"/>
+        </w:pBdr>
+        <w:shd w:fill="F2F2F2" w:val="clear"/>
+        <w:spacing w:after="0"/>
+      </w:pPr>
+      <w:r>
+        <w:rPr>
+          <w:rFonts w:ascii="Consolas" w:cs="Consolas" w:eastAsia="Consolas" w:hAnsi="Consolas"/>
+          <w:sz w:val="20"/>
+          <w:szCs w:val="20"/>
+        </w:rPr>
+        <w:t xml:space="preserve">   │  login exitoso, o ya había una sesión guardada     │  registro exitoso</w:t>
+      </w:r>
+    </w:p>
+    <w:p>
+      <w:pPr>
+        <w:pBdr>
+          <w:left w:val="single" w:color="CCCCCC" w:sz="4"/>
+          <w:right w:val="single" w:color="CCCCCC" w:sz="4"/>
+        </w:pBdr>
+        <w:shd w:fill="F2F2F2" w:val="clear"/>
+        <w:spacing w:after="0"/>
+      </w:pPr>
+      <w:r>
+        <w:rPr>
+          <w:rFonts w:ascii="Consolas" w:cs="Consolas" w:eastAsia="Consolas" w:hAnsi="Consolas"/>
+          <w:sz w:val="20"/>
+          <w:szCs w:val="20"/>
+        </w:rPr>
+        <w:t xml:space="preserve">   ▼                                                   ▼</w:t>
+      </w:r>
+    </w:p>
+    <w:p>
+      <w:pPr>
+        <w:pBdr>
+          <w:left w:val="single" w:color="CCCCCC" w:sz="4"/>
+          <w:right w:val="single" w:color="CCCCCC" w:sz="4"/>
+        </w:pBdr>
+        <w:shd w:fill="F2F2F2" w:val="clear"/>
+        <w:spacing w:after="0"/>
+      </w:pPr>
+      <w:r>
+        <w:rPr>
+          <w:rFonts w:ascii="Consolas" w:cs="Consolas" w:eastAsia="Consolas" w:hAnsi="Consolas"/>
+          <w:sz w:val="20"/>
+          <w:szCs w:val="20"/>
+        </w:rPr>
+        <w:t xml:space="preserve">              DashboardActivity  ──────────────┐</w:t>
+      </w:r>
+    </w:p>
+    <w:p>
+      <w:pPr>
+        <w:pBdr>
+          <w:left w:val="single" w:color="CCCCCC" w:sz="4"/>
+          <w:right w:val="single" w:color="CCCCCC" w:sz="4"/>
+        </w:pBdr>
+        <w:shd w:fill="F2F2F2" w:val="clear"/>
+        <w:spacing w:after="0"/>
+      </w:pPr>
+      <w:r>
+        <w:rPr>
+          <w:rFonts w:ascii="Consolas" w:cs="Consolas" w:eastAsia="Consolas" w:hAnsi="Consolas"/>
+          <w:sz w:val="20"/>
+          <w:szCs w:val="20"/>
+        </w:rPr>
+        <w:t xml:space="preserve">                 │                            │</w:t>
+      </w:r>
+    </w:p>
+    <w:p>
+      <w:pPr>
+        <w:pBdr>
+          <w:left w:val="single" w:color="CCCCCC" w:sz="4"/>
+          <w:right w:val="single" w:color="CCCCCC" w:sz="4"/>
+        </w:pBdr>
+        <w:shd w:fill="F2F2F2" w:val="clear"/>
+        <w:spacing w:after="0"/>
+      </w:pPr>
+      <w:r>
+        <w:rPr>
+          <w:rFonts w:ascii="Consolas" w:cs="Consolas" w:eastAsia="Consolas" w:hAnsi="Consolas"/>
+          <w:sz w:val="20"/>
+          <w:szCs w:val="20"/>
+        </w:rPr>
+        <w:t xml:space="preserve">                 ▼ "Crear nota"                ▼ "Ver mis notas"</w:t>
+      </w:r>
+    </w:p>
+    <w:p>
+      <w:pPr>
+        <w:pBdr>
+          <w:left w:val="single" w:color="CCCCCC" w:sz="4"/>
+          <w:right w:val="single" w:color="CCCCCC" w:sz="4"/>
+        </w:pBdr>
+        <w:shd w:fill="F2F2F2" w:val="clear"/>
+        <w:spacing w:after="0"/>
+      </w:pPr>
+      <w:r>
+        <w:rPr>
+          <w:rFonts w:ascii="Consolas" w:cs="Consolas" w:eastAsia="Consolas" w:hAnsi="Consolas"/>
+          <w:sz w:val="20"/>
+          <w:szCs w:val="20"/>
+        </w:rPr>
+        <w:t xml:space="preserve">          CreateNoteActivity          NotesListActivity</w:t>
       </w:r>
     </w:p>
     <w:p>
@@ -947,6 +947,17 @@
         <w:rPr>
           <w:rFonts w:ascii="Calibri" w:cs="Calibri" w:eastAsia="Calibri" w:hAnsi="Calibri"/>
         </w:rPr>
+        <w:t xml:space="preserve">•  Registrarse (RegisterActivity) hace exactamente lo mismo: el backend responde con token + usuario igual que el login, así que la cuenta recién creada queda con la sesión ya iniciada, sin pedirle al usuario loguearse aparte.</w:t>
+      </w:r>
+    </w:p>
+    <w:p>
+      <w:pPr>
+        <w:spacing w:after="80"/>
+      </w:pPr>
+      <w:r>
+        <w:rPr>
+          <w:rFonts w:ascii="Calibri" w:cs="Calibri" w:eastAsia="Calibri" w:hAnsi="Calibri"/>
+        </w:rPr>
         <w:t xml:space="preserve">•  AuthInterceptor agrega automáticamente el header Authorization: Bearer &lt;token&gt; a toda petición saliente, leyendo el token desde SessionManager. Por eso ningún Repository arma ese header manualmente.</w:t>
       </w:r>
     </w:p>
@@ -1003,7 +1014,7 @@
         <w:rPr>
           <w:rFonts w:ascii="Calibri" w:cs="Calibri" w:eastAsia="Calibri" w:hAnsi="Calibri"/>
         </w:rPr>
-        <w:t xml:space="preserve">ApiService define los tres endpoints que la app necesita. El contrato exacto (rutas y forma del JSON) se definió de forma razonable mientras no existía el backend; queda documentado aquí y en los propios archivos de código (dto/ y ApiService.kt) para ajustarlo fácilmente:</w:t>
+        <w:t xml:space="preserve">ApiService define los tres endpoints que la app necesita (más registro, ver sección 10). El contrato exacto (rutas y forma del JSON) está implementado en NotasApi y queda documentado aquí y en los propios archivos de código (dto/ y ApiService.kt):</w:t>
       </w:r>
     </w:p>
     <w:p>
@@ -1106,7 +1117,7 @@
         <w:rPr>
           <w:rFonts w:ascii="Calibri" w:cs="Calibri" w:eastAsia="Calibri" w:hAnsi="Calibri"/>
         </w:rPr>
-        <w:t xml:space="preserve">La URL base del backend está centralizada en RetrofitClient.BASE_URL, marcada con un comentario TODO: es el único lugar que hay que editar cuando el backend esté desplegado.</w:t>
+        <w:t xml:space="preserve">La URL base del backend está centralizada en RetrofitClient.BASE_URL: es el único lugar que habría que editar si el backend se despliega en otro servidor en vez de correr localmente.</w:t>
       </w:r>
     </w:p>
     <w:p>
@@ -1219,7 +1230,7 @@
                 <w:sz w:val="20"/>
                 <w:szCs w:val="20"/>
               </w:rPr>
-              <w:t xml:space="preserve">Crear nota</w:t>
+              <w:t xml:space="preserve">Crear cuenta</w:t>
             </w:r>
           </w:p>
         </w:tc>
@@ -1234,7 +1245,7 @@
                 <w:sz w:val="20"/>
                 <w:szCs w:val="20"/>
               </w:rPr>
-              <w:t xml:space="preserve">Título y contenido no vacíos (se recortan espacios en blanco antes de validar). Título limitado a 100 caracteres.</w:t>
+              <w:t xml:space="preserve">Nombre, correo y contraseña no vacíos; formato de correo válido; contraseña de al menos 4 caracteres. Si el correo ya está registrado, el backend responde 409 y se muestra el mensaje correspondiente.</w:t>
             </w:r>
           </w:p>
         </w:tc>
@@ -1251,6 +1262,38 @@
                 <w:sz w:val="20"/>
                 <w:szCs w:val="20"/>
               </w:rPr>
+              <w:t xml:space="preserve">Crear nota</w:t>
+            </w:r>
+          </w:p>
+        </w:tc>
+        <w:tc>
+          <w:tcPr>
+            <w:tcW w:type="dxa" w:w="7100"/>
+          </w:tcPr>
+          <w:p>
+            <w:r>
+              <w:rPr>
+                <w:rFonts w:ascii="Calibri" w:cs="Calibri" w:eastAsia="Calibri" w:hAnsi="Calibri"/>
+                <w:sz w:val="20"/>
+                <w:szCs w:val="20"/>
+              </w:rPr>
+              <w:t xml:space="preserve">Título y contenido no vacíos (se recortan espacios en blanco antes de validar). Título limitado a 100 caracteres.</w:t>
+            </w:r>
+          </w:p>
+        </w:tc>
+      </w:tr>
+      <w:tr>
+        <w:tc>
+          <w:tcPr>
+            <w:tcW w:type="dxa" w:w="2400"/>
+          </w:tcPr>
+          <w:p>
+            <w:r>
+              <w:rPr>
+                <w:rFonts w:ascii="Calibri" w:cs="Calibri" w:eastAsia="Calibri" w:hAnsi="Calibri"/>
+                <w:sz w:val="20"/>
+                <w:szCs w:val="20"/>
+              </w:rPr>
               <w:t xml:space="preserve">General</w:t>
             </w:r>
           </w:p>
@@ -1281,7 +1324,7 @@
         <w:rPr>
           <w:rFonts w:ascii="Calibri" w:cs="Calibri" w:eastAsia="Calibri" w:hAnsi="Calibri"/>
         </w:rPr>
-        <w:t xml:space="preserve">10. Pendiente</w:t>
+        <w:t xml:space="preserve">10. Backend</w:t>
       </w:r>
     </w:p>
     <w:p>
@@ -1292,7 +1335,7 @@
         <w:rPr>
           <w:rFonts w:ascii="Calibri" w:cs="Calibri" w:eastAsia="Calibri" w:hAnsi="Calibri"/>
         </w:rPr>
-        <w:t xml:space="preserve">La única parte no implementada es el backend real: la URL (RetrofitClient.BASE_URL) y, si el formato de datos definido con el Ingeniero a cargo difiere del propuesto en este documento, los campos de las clases en dto/AuthDto.kt y dto/NotaDto.kt. El resto de la aplicación (pantallas, validaciones, manejo de sesión, arquitectura) no depende de esos detalles y no requiere cambios.</w:t>
+        <w:t xml:space="preserve">El backend (NotasApi, carpeta hermana ../NotasApi) ya está implementado: Node.js + Express + SQLite, con el mismo contrato descrito en la sección 8. Crea automáticamente un usuario de prueba (admin@notasapp.com / admin) para no depender de datos hardcodeados dentro del código de la app. RetrofitClient.BASE_URL apunta a http://10.0.2.2:3000/ (la dirección con la que el emulador de Android ve al localhost de la PC); para un dispositivo físico en la misma red Wi-Fi basta con cambiar esa constante por la IP que NotasApi imprime al arrancar.</w:t>
       </w:r>
     </w:p>
     <w:sectPr>
@@ -1586,6 +1629,139 @@
     <w:basedOn w:val="Normal"/>
     <w:qFormat/>
   </w:style>
+  <w:style w:type="paragraph" w:styleId="Caption">
+    <w:name w:val="caption"/>
+    <w:basedOn w:val="Normal"/>
+    <w:next w:val="Normal"/>
+    <w:uiPriority w:val="35"/>
+    <w:semiHidden/>
+    <w:unhideWhenUsed/>
+    <w:qFormat/>
+    <w:pPr>
+      <w:spacing w:after="200"/>
+    </w:pPr>
+    <w:rPr>
+      <w:i/>
+      <w:iCs/>
+      <w:color w:val="44546A" w:themeColor="dark2"/>
+      <w:sz w:val="18"/>
+      <w:szCs w:val="18"/>
+    </w:rPr>
+  </w:style>
+  <w:style w:type="paragraph" w:styleId="Bibliography">
+    <w:name w:val="Bibliography"/>
+    <w:basedOn w:val="Normal"/>
+    <w:next w:val="Normal"/>
+    <w:uiPriority w:val="37"/>
+    <w:unhideWhenUsed/>
+  </w:style>
+  <w:style w:type="paragraph" w:styleId="TOC1">
+    <w:name w:val="toc 1"/>
+    <w:basedOn w:val="Normal"/>
+    <w:next w:val="Normal"/>
+    <w:uiPriority w:val="39"/>
+    <w:semiHidden/>
+    <w:unhideWhenUsed/>
+    <w:pPr>
+      <w:spacing w:after="100"/>
+    </w:pPr>
+  </w:style>
+  <w:style w:type="paragraph" w:styleId="TOC2">
+    <w:name w:val="toc 2"/>
+    <w:basedOn w:val="Normal"/>
+    <w:next w:val="Normal"/>
+    <w:uiPriority w:val="39"/>
+    <w:semiHidden/>
+    <w:unhideWhenUsed/>
+    <w:pPr>
+      <w:spacing w:after="100"/>
+      <w:ind w:left="200"/>
+    </w:pPr>
+  </w:style>
+  <w:style w:type="paragraph" w:styleId="TOC3">
+    <w:name w:val="toc 3"/>
+    <w:basedOn w:val="Normal"/>
+    <w:next w:val="Normal"/>
+    <w:uiPriority w:val="39"/>
+    <w:semiHidden/>
+    <w:unhideWhenUsed/>
+    <w:pPr>
+      <w:spacing w:after="100"/>
+      <w:ind w:left="400"/>
+    </w:pPr>
+  </w:style>
+  <w:style w:type="paragraph" w:styleId="TOC4">
+    <w:name w:val="toc 4"/>
+    <w:basedOn w:val="Normal"/>
+    <w:next w:val="Normal"/>
+    <w:uiPriority w:val="39"/>
+    <w:semiHidden/>
+    <w:unhideWhenUsed/>
+    <w:pPr>
+      <w:spacing w:after="100"/>
+      <w:ind w:left="600"/>
+    </w:pPr>
+  </w:style>
+  <w:style w:type="paragraph" w:styleId="TOC5">
+    <w:name w:val="toc 5"/>
+    <w:basedOn w:val="Normal"/>
+    <w:next w:val="Normal"/>
+    <w:uiPriority w:val="39"/>
+    <w:semiHidden/>
+    <w:unhideWhenUsed/>
+    <w:pPr>
+      <w:spacing w:after="100"/>
+      <w:ind w:left="800"/>
+    </w:pPr>
+  </w:style>
+  <w:style w:type="paragraph" w:styleId="TOC6">
+    <w:name w:val="toc 6"/>
+    <w:basedOn w:val="Normal"/>
+    <w:next w:val="Normal"/>
+    <w:uiPriority w:val="39"/>
+    <w:semiHidden/>
+    <w:unhideWhenUsed/>
+    <w:pPr>
+      <w:spacing w:after="100"/>
+      <w:ind w:left="1000"/>
+    </w:pPr>
+  </w:style>
+  <w:style w:type="paragraph" w:styleId="TOC7">
+    <w:name w:val="toc 7"/>
+    <w:basedOn w:val="Normal"/>
+    <w:next w:val="Normal"/>
+    <w:uiPriority w:val="39"/>
+    <w:semiHidden/>
+    <w:unhideWhenUsed/>
+    <w:pPr>
+      <w:spacing w:after="100"/>
+      <w:ind w:left="1200"/>
+    </w:pPr>
+  </w:style>
+  <w:style w:type="paragraph" w:styleId="TOC8">
+    <w:name w:val="toc 8"/>
+    <w:basedOn w:val="Normal"/>
+    <w:next w:val="Normal"/>
+    <w:uiPriority w:val="39"/>
+    <w:semiHidden/>
+    <w:unhideWhenUsed/>
+    <w:pPr>
+      <w:spacing w:after="100"/>
+      <w:ind w:left="1400"/>
+    </w:pPr>
+  </w:style>
+  <w:style w:type="paragraph" w:styleId="TOC9">
+    <w:name w:val="toc 9"/>
+    <w:basedOn w:val="Normal"/>
+    <w:next w:val="Normal"/>
+    <w:uiPriority w:val="39"/>
+    <w:semiHidden/>
+    <w:unhideWhenUsed/>
+    <w:pPr>
+      <w:spacing w:after="100"/>
+      <w:ind w:left="1600"/>
+    </w:pPr>
+  </w:style>
   <w:style w:type="character" w:styleId="Hyperlink">
     <w:name w:val="Hyperlink"/>
     <w:basedOn w:val="DefaultParagraphFont"/>
@@ -1669,6 +1845,13 @@
       <w:sz w:val="20"/>
       <w:szCs w:val="20"/>
     </w:rPr>
+  </w:style>
+  <w:style w:type="character" w:styleId="LineNumber">
+    <w:name w:val="line number"/>
+    <w:basedOn w:val="DefaultParagraphFont"/>
+    <w:uiPriority w:val="99"/>
+    <w:semiHidden/>
+    <w:unhideWhenUsed/>
   </w:style>
 </w:styles>
 </file>

</xml_diff>